<commit_message>
Data reconciliation: merge expansion protocols into canonical dataset
- governance_concentration: 36 → 39 (added ATH/HONEY/IO from data/ + HYPE from root)
- regression_data: 37 → 40 (same + BAL regression-only)
- Backfilled financials for ATH/HONEY/IO: revenue, subsidy_ratio, log fields
- Synced root files with data/ (both now canonical)
- Updated regression_results.json: n_total=40, n_subsidy=19, n_regression_ready=38
- Updated full_merged_dataset to 40 protocols
- Also stages prior session work: B2_Final_v5, float analysis, insider classification,
  tier2 results, unpacked_fig, holder_lists/BAL

Co-Authored-By: Claude Sonnet 4.6 <noreply@anthropic.com>
</commit_message>
<xml_diff>
--- a/B2_Final_v5.docx
+++ b/B2_Final_v5.docx
@@ -1498,7 +1498,7 @@
           <w:i/>
           <w:sz w:val="20"/>
         </w:rPr>
-        <w:t>Figure 1. Conceptual model: from philosophical constraints through institutional design to outcomes. Philosophical traditions (Layer 1) constrain institutional design choices (Layer 2), which shape behavioral equilibria (Layer 3) and produce measurable outcomes across economic, political, and social domains (Layer 4).</w:t>
+        <w:t>Figure 2. Conceptual model: from philosophical constraints through institutional design to outcomes. Philosophical traditions (Layer 1) constrain institutional design choices (Layer 2), which shape behavioral equilibria (Layer 3) and produce measurable outcomes across economic, political, and social domains (Layer 4).</w:t>
       </w:r>
     </w:p>
     <w:p>
@@ -2118,7 +2118,7 @@
           <w:i/>
           <w:sz w:val="18"/>
         </w:rPr>
-        <w:t>Figure 2. Normative framework architecture: five philosophical lenses are operationalized through a scoring rubric into five testable design hypotheses. Dashed arrow indicates the empirical feedback loop from governance concentration evidence (Section 5) and case evidence developed separately.</w:t>
+        <w:t>Figure 3. Normative framework architecture: five philosophical lenses are operationalized through a scoring rubric into five testable design hypotheses. Dashed arrow indicates the empirical feedback loop from governance concentration evidence (Section 5) and case evidence developed separately.</w:t>
       </w:r>
     </w:p>
     <w:p>
@@ -2190,7 +2190,7 @@
           <w:i/>
           <w:sz w:val="18"/>
         </w:rPr>
-        <w:t>Figure 3. Holding-based Herfindahl-Hirschman Index (HHI) across 35 governance tokens (March 2026 snapshot, top-1,000 holders, protocol-controlled addresses excluded). Dashed lines indicate category means. Protocols sorted by category then HHI ascending.</w:t>
+        <w:t>Figure 4. Holding-based Herfindahl-Hirschman Index (HHI) across 35 governance tokens (March 2026 snapshot, top-1,000 holders, protocol-controlled addresses excluded). Dashed lines indicate category means. Protocols sorted by category then HHI ascending.</w:t>
       </w:r>
     </w:p>
     <w:p>
@@ -7146,7 +7146,7 @@
           <w:i/>
           <w:sz w:val="20"/>
         </w:rPr>
-        <w:t xml:space="preserve">Figure 4. Insider allocation (%) vs. corrected holding HHI for 33 regression-ready protocols.</w:t>
+        <w:t xml:space="preserve">Figure 1. Insider allocation (%) vs. corrected holding HHI for 33 regression-ready protocols.</w:t>
       </w:r>
     </w:p>
     <w:p>

</xml_diff>